<commit_message>
template: remove orphan page after editor section, refresh examples
Drop the pagebreak between the editor section and Reviewer 1 and tighten
the editor prose, so page 2 flows continuously instead of stranding a
single reply. Regenerate examples and README screenshots.
</commit_message>
<xml_diff>
--- a/examples/example.docx
+++ b/examples/example.docx
@@ -89,31 +89,31 @@
         <w:pStyle w:val="BodyText"/>
       </w:pPr>
       <w:r>
-        <w:t xml:space="preserve">Thank you for the opportunity to revise our manuscript. We have addressed every</w:t>
-      </w:r>
-      <w:r>
-        <w:t xml:space="preserve"> </w:t>
-      </w:r>
-      <w:r>
-        <w:t xml:space="preserve">comment from you and both reviewers point-by-point below. Reviewer comments</w:t>
-      </w:r>
-      <w:r>
-        <w:t xml:space="preserve"> </w:t>
-      </w:r>
-      <w:r>
-        <w:t xml:space="preserve">appear in red boxes, our replies in blue boxes, verbatim text from the revised</w:t>
-      </w:r>
-      <w:r>
-        <w:t xml:space="preserve"> </w:t>
-      </w:r>
-      <w:r>
-        <w:t xml:space="preserve">manuscript in grey boxes, and the resulting changes in green boxes. All page</w:t>
-      </w:r>
-      <w:r>
-        <w:t xml:space="preserve"> </w:t>
-      </w:r>
-      <w:r>
-        <w:t xml:space="preserve">numbers refer to the revised manuscript with tracked changes.</w:t>
+        <w:t xml:space="preserve">Thank you for the opportunity to revise our manuscript. We address every</w:t>
+      </w:r>
+      <w:r>
+        <w:t xml:space="preserve"> </w:t>
+      </w:r>
+      <w:r>
+        <w:t xml:space="preserve">comment point-by-point below: reviewer comments in red boxes, our replies in</w:t>
+      </w:r>
+      <w:r>
+        <w:t xml:space="preserve"> </w:t>
+      </w:r>
+      <w:r>
+        <w:t xml:space="preserve">blue, verbatim text from the revised manuscript in grey, and the resulting</w:t>
+      </w:r>
+      <w:r>
+        <w:t xml:space="preserve"> </w:t>
+      </w:r>
+      <w:r>
+        <w:t xml:space="preserve">changes in green. All page numbers refer to the revised manuscript with</w:t>
+      </w:r>
+      <w:r>
+        <w:t xml:space="preserve"> </w:t>
+      </w:r>
+      <w:r>
+        <w:t xml:space="preserve">tracked changes.</w:t>
       </w:r>
     </w:p>
     <w:p>
@@ -246,19 +246,19 @@
         <w:pStyle w:val="ResponseComment"/>
       </w:pPr>
       <w:r>
-        <w:t xml:space="preserve">Both reviewers find the question timely and the design sound. They converge,</w:t>
-      </w:r>
-      <w:r>
-        <w:t xml:space="preserve"> </w:t>
-      </w:r>
-      <w:r>
-        <w:t xml:space="preserve">however, on the analysis: the sample-size justification and the robustness of</w:t>
-      </w:r>
-      <w:r>
-        <w:t xml:space="preserve"> </w:t>
-      </w:r>
-      <w:r>
-        <w:t xml:space="preserve">the central effect both need strengthening before the paper can be accepted.</w:t>
+        <w:t xml:space="preserve">Both reviewers find the question timely and the design sound, but converge</w:t>
+      </w:r>
+      <w:r>
+        <w:t xml:space="preserve"> </w:t>
+      </w:r>
+      <w:r>
+        <w:t xml:space="preserve">on two analysis concerns: the sample-size justification and the robustness</w:t>
+      </w:r>
+      <w:r>
+        <w:t xml:space="preserve"> </w:t>
+      </w:r>
+      <w:r>
+        <w:t xml:space="preserve">of the central effect.</w:t>
       </w:r>
     </w:p>
     <w:p>
@@ -278,22 +278,19 @@
         <w:pStyle w:val="ResponseReply"/>
       </w:pPr>
       <w:r>
-        <w:t xml:space="preserve">We thank the editor for handling our manuscript and for the concise synthesis</w:t>
-      </w:r>
-      <w:r>
-        <w:t xml:space="preserve"> </w:t>
-      </w:r>
-      <w:r>
-        <w:t xml:space="preserve">of the reviews. We have strengthened both points the reviewers raise: the</w:t>
-      </w:r>
-      <w:r>
-        <w:t xml:space="preserve"> </w:t>
-      </w:r>
-      <w:r>
-        <w:t xml:space="preserve">sample size is now justified by an a priori power analysis (see</w:t>
-      </w:r>
-      <w:r>
-        <w:t xml:space="preserve"> </w:t>
+        <w:t xml:space="preserve">We thank the editor for the concise synthesis. Both points are addressed in</w:t>
+      </w:r>
+      <w:r>
+        <w:t xml:space="preserve"> </w:t>
+      </w:r>
+      <w:r>
+        <w:t xml:space="preserve">full: the sample size is now justified by an a priori power analysis</w:t>
+      </w:r>
+      <w:r>
+        <w:t xml:space="preserve"> </w:t>
+      </w:r>
+      <w:r>
+        <w:t xml:space="preserve">(</w:t>
       </w:r>
       <w:hyperlink w:anchor="cmt-1-1">
         <w:r>
@@ -310,10 +307,7 @@
         <w:t xml:space="preserve"> </w:t>
       </w:r>
       <w:r>
-        <w:t xml:space="preserve">analytic choices (see</w:t>
-      </w:r>
-      <w:r>
-        <w:t xml:space="preserve"> </w:t>
+        <w:t xml:space="preserve">analytic choices (</w:t>
       </w:r>
       <w:hyperlink w:anchor="cmt-1-2">
         <w:r>
@@ -345,13 +339,13 @@
         <w:pStyle w:val="ResponseComment"/>
       </w:pPr>
       <w:r>
-        <w:t xml:space="preserve">Please confirm that the data and analysis scripts are available, and state</w:t>
-      </w:r>
-      <w:r>
-        <w:t xml:space="preserve"> </w:t>
-      </w:r>
-      <w:r>
-        <w:t xml:space="preserve">where, in line with the journal’s open-science policy.</w:t>
+        <w:t xml:space="preserve">Please confirm that the data and analysis scripts are openly available, in</w:t>
+      </w:r>
+      <w:r>
+        <w:t xml:space="preserve"> </w:t>
+      </w:r>
+      <w:r>
+        <w:t xml:space="preserve">line with the journal’s open-science policy.</w:t>
       </w:r>
     </w:p>
     <w:bookmarkEnd w:id="20"/>
@@ -372,18 +366,13 @@
         <w:pStyle w:val="ResponseReply"/>
       </w:pPr>
       <w:r>
-        <w:t xml:space="preserve">The data and analysis scripts are openly available on the OSF (link in the</w:t>
-      </w:r>
-      <w:r>
-        <w:t xml:space="preserve"> </w:t>
-      </w:r>
-      <w:r>
-        <w:t xml:space="preserve">manuscript). We now state this in a Data Availability statement (p. 18).</w:t>
-      </w:r>
-    </w:p>
-    <w:p>
-      <w:r>
-        <w:br w:type="page"/>
+        <w:t xml:space="preserve">Both are available on the OSF; we now say so in a Data Availability</w:t>
+      </w:r>
+      <w:r>
+        <w:t xml:space="preserve"> </w:t>
+      </w:r>
+      <w:r>
+        <w:t xml:space="preserve">statement (p. 18).</w:t>
       </w:r>
     </w:p>
     <w:bookmarkEnd w:id="21"/>

</xml_diff>